<commit_message>
ArchiMate: схема модуля авторизации — docs/archimate/auth-architecture.drawio
Файл переименован из base-architecture: базовая архитектура ТСЛ остаётся у владельцев схемы, здесь — её версия с TSL Auth и листы детализации. Схема пересобрана на актуальной базовой (со связями OpenBao ко всем сервисам).

Co-Authored-By: Claude Opus 5.5 <noreply@anthropic.com>
</commit_message>
<xml_diff>
--- a/docs/TZ-tsl-auth.docx
+++ b/docs/TZ-tsl-auth.docx
@@ -97,7 +97,7 @@
     <w:sdt>
       <w:sdtPr>
         <w:alias w:val="Содержание"/>
-        <w:id w:val="-309788499"/>
+        <w:id w:val="-900588501"/>
       </w:sdtPr>
       <w:sdtEndPr/>
       <w:sdtContent>
@@ -125,7 +125,7 @@
           <w:r>
             <w:fldChar w:fldCharType="separate"/>
           </w:r>
-          <w:hyperlink w:anchor="_Toc241429366" w:history="1">
+          <w:hyperlink w:anchor="_Toc241436968" w:history="1">
             <w:r>
               <w:rPr>
                 <w:rStyle w:val="a5"/>
@@ -149,7 +149,7 @@
               <w:rPr>
                 <w:noProof/>
               </w:rPr>
-              <w:instrText xml:space="preserve"> PAGEREF _Toc241429366 \h </w:instrText>
+              <w:instrText xml:space="preserve"> PAGEREF _Toc241436968 \h </w:instrText>
             </w:r>
             <w:r>
               <w:rPr>
@@ -191,7 +191,7 @@
               <w14:ligatures w14:val="standardContextual"/>
             </w:rPr>
           </w:pPr>
-          <w:hyperlink w:anchor="_Toc241429367" w:history="1">
+          <w:hyperlink w:anchor="_Toc241436969" w:history="1">
             <w:r>
               <w:rPr>
                 <w:rStyle w:val="a5"/>
@@ -215,7 +215,7 @@
               <w:rPr>
                 <w:noProof/>
               </w:rPr>
-              <w:instrText xml:space="preserve"> PAGEREF _Toc241429367 \h </w:instrText>
+              <w:instrText xml:space="preserve"> PAGEREF _Toc241436969 \h </w:instrText>
             </w:r>
             <w:r>
               <w:rPr>
@@ -257,7 +257,7 @@
               <w14:ligatures w14:val="standardContextual"/>
             </w:rPr>
           </w:pPr>
-          <w:hyperlink w:anchor="_Toc241429368" w:history="1">
+          <w:hyperlink w:anchor="_Toc241436970" w:history="1">
             <w:r>
               <w:rPr>
                 <w:rStyle w:val="a5"/>
@@ -281,7 +281,7 @@
               <w:rPr>
                 <w:noProof/>
               </w:rPr>
-              <w:instrText xml:space="preserve"> PAGEREF _Toc241429368 \h </w:instrText>
+              <w:instrText xml:space="preserve"> PAGEREF _Toc241436970 \h </w:instrText>
             </w:r>
             <w:r>
               <w:rPr>
@@ -323,7 +323,7 @@
               <w14:ligatures w14:val="standardContextual"/>
             </w:rPr>
           </w:pPr>
-          <w:hyperlink w:anchor="_Toc241429369" w:history="1">
+          <w:hyperlink w:anchor="_Toc241436971" w:history="1">
             <w:r>
               <w:rPr>
                 <w:rStyle w:val="a5"/>
@@ -347,7 +347,7 @@
               <w:rPr>
                 <w:noProof/>
               </w:rPr>
-              <w:instrText xml:space="preserve"> PAGEREF _Toc241429369 \h </w:instrText>
+              <w:instrText xml:space="preserve"> PAGEREF _Toc241436971 \h </w:instrText>
             </w:r>
             <w:r>
               <w:rPr>
@@ -389,7 +389,7 @@
               <w14:ligatures w14:val="standardContextual"/>
             </w:rPr>
           </w:pPr>
-          <w:hyperlink w:anchor="_Toc241429370" w:history="1">
+          <w:hyperlink w:anchor="_Toc241436972" w:history="1">
             <w:r>
               <w:rPr>
                 <w:rStyle w:val="a5"/>
@@ -413,7 +413,7 @@
               <w:rPr>
                 <w:noProof/>
               </w:rPr>
-              <w:instrText xml:space="preserve"> PAGEREF _Toc241429370 \h </w:instrText>
+              <w:instrText xml:space="preserve"> PAGEREF _Toc241436972 \h </w:instrText>
             </w:r>
             <w:r>
               <w:rPr>
@@ -455,7 +455,7 @@
               <w14:ligatures w14:val="standardContextual"/>
             </w:rPr>
           </w:pPr>
-          <w:hyperlink w:anchor="_Toc241429371" w:history="1">
+          <w:hyperlink w:anchor="_Toc241436973" w:history="1">
             <w:r>
               <w:rPr>
                 <w:rStyle w:val="a5"/>
@@ -479,7 +479,7 @@
               <w:rPr>
                 <w:noProof/>
               </w:rPr>
-              <w:instrText xml:space="preserve"> PAGEREF _Toc241429371 \h </w:instrText>
+              <w:instrText xml:space="preserve"> PAGEREF _Toc241436973 \h </w:instrText>
             </w:r>
             <w:r>
               <w:rPr>
@@ -521,7 +521,7 @@
               <w14:ligatures w14:val="standardContextual"/>
             </w:rPr>
           </w:pPr>
-          <w:hyperlink w:anchor="_Toc241429372" w:history="1">
+          <w:hyperlink w:anchor="_Toc241436974" w:history="1">
             <w:r>
               <w:rPr>
                 <w:rStyle w:val="a5"/>
@@ -545,7 +545,7 @@
               <w:rPr>
                 <w:noProof/>
               </w:rPr>
-              <w:instrText xml:space="preserve"> PAGEREF _Toc241429372 \h </w:instrText>
+              <w:instrText xml:space="preserve"> PAGEREF _Toc241436974 \h </w:instrText>
             </w:r>
             <w:r>
               <w:rPr>
@@ -587,7 +587,7 @@
               <w14:ligatures w14:val="standardContextual"/>
             </w:rPr>
           </w:pPr>
-          <w:hyperlink w:anchor="_Toc241429373" w:history="1">
+          <w:hyperlink w:anchor="_Toc241436975" w:history="1">
             <w:r>
               <w:rPr>
                 <w:rStyle w:val="a5"/>
@@ -611,7 +611,7 @@
               <w:rPr>
                 <w:noProof/>
               </w:rPr>
-              <w:instrText xml:space="preserve"> PAGEREF _Toc241429373 \h </w:instrText>
+              <w:instrText xml:space="preserve"> PAGEREF _Toc241436975 \h </w:instrText>
             </w:r>
             <w:r>
               <w:rPr>
@@ -653,7 +653,7 @@
               <w14:ligatures w14:val="standardContextual"/>
             </w:rPr>
           </w:pPr>
-          <w:hyperlink w:anchor="_Toc241429374" w:history="1">
+          <w:hyperlink w:anchor="_Toc241436976" w:history="1">
             <w:r>
               <w:rPr>
                 <w:rStyle w:val="a5"/>
@@ -677,7 +677,7 @@
               <w:rPr>
                 <w:noProof/>
               </w:rPr>
-              <w:instrText xml:space="preserve"> PAGEREF _Toc241429374 \h </w:instrText>
+              <w:instrText xml:space="preserve"> PAGEREF _Toc241436976 \h </w:instrText>
             </w:r>
             <w:r>
               <w:rPr>
@@ -719,7 +719,7 @@
               <w14:ligatures w14:val="standardContextual"/>
             </w:rPr>
           </w:pPr>
-          <w:hyperlink w:anchor="_Toc241429375" w:history="1">
+          <w:hyperlink w:anchor="_Toc241436977" w:history="1">
             <w:r>
               <w:rPr>
                 <w:rStyle w:val="a5"/>
@@ -743,7 +743,7 @@
               <w:rPr>
                 <w:noProof/>
               </w:rPr>
-              <w:instrText xml:space="preserve"> PAGEREF _Toc241429375 \h </w:instrText>
+              <w:instrText xml:space="preserve"> PAGEREF _Toc241436977 \h </w:instrText>
             </w:r>
             <w:r>
               <w:rPr>
@@ -785,7 +785,7 @@
               <w14:ligatures w14:val="standardContextual"/>
             </w:rPr>
           </w:pPr>
-          <w:hyperlink w:anchor="_Toc241429376" w:history="1">
+          <w:hyperlink w:anchor="_Toc241436978" w:history="1">
             <w:r>
               <w:rPr>
                 <w:rStyle w:val="a5"/>
@@ -809,7 +809,7 @@
               <w:rPr>
                 <w:noProof/>
               </w:rPr>
-              <w:instrText xml:space="preserve"> PAGEREF _Toc241429376 \h </w:instrText>
+              <w:instrText xml:space="preserve"> PAGEREF _Toc241436978 \h </w:instrText>
             </w:r>
             <w:r>
               <w:rPr>
@@ -851,7 +851,7 @@
               <w14:ligatures w14:val="standardContextual"/>
             </w:rPr>
           </w:pPr>
-          <w:hyperlink w:anchor="_Toc241429377" w:history="1">
+          <w:hyperlink w:anchor="_Toc241436979" w:history="1">
             <w:r>
               <w:rPr>
                 <w:rStyle w:val="a5"/>
@@ -875,7 +875,7 @@
               <w:rPr>
                 <w:noProof/>
               </w:rPr>
-              <w:instrText xml:space="preserve"> PAGEREF _Toc241429377 \h </w:instrText>
+              <w:instrText xml:space="preserve"> PAGEREF _Toc241436979 \h </w:instrText>
             </w:r>
             <w:r>
               <w:rPr>
@@ -917,7 +917,7 @@
               <w14:ligatures w14:val="standardContextual"/>
             </w:rPr>
           </w:pPr>
-          <w:hyperlink w:anchor="_Toc241429378" w:history="1">
+          <w:hyperlink w:anchor="_Toc241436980" w:history="1">
             <w:r>
               <w:rPr>
                 <w:rStyle w:val="a5"/>
@@ -941,7 +941,7 @@
               <w:rPr>
                 <w:noProof/>
               </w:rPr>
-              <w:instrText xml:space="preserve"> PAGEREF _Toc241429378 \h </w:instrText>
+              <w:instrText xml:space="preserve"> PAGEREF _Toc241436980 \h </w:instrText>
             </w:r>
             <w:r>
               <w:rPr>
@@ -983,7 +983,7 @@
               <w14:ligatures w14:val="standardContextual"/>
             </w:rPr>
           </w:pPr>
-          <w:hyperlink w:anchor="_Toc241429379" w:history="1">
+          <w:hyperlink w:anchor="_Toc241436981" w:history="1">
             <w:r>
               <w:rPr>
                 <w:rStyle w:val="a5"/>
@@ -1007,7 +1007,7 @@
               <w:rPr>
                 <w:noProof/>
               </w:rPr>
-              <w:instrText xml:space="preserve"> PAGEREF _Toc241429379 \h </w:instrText>
+              <w:instrText xml:space="preserve"> PAGEREF _Toc241436981 \h </w:instrText>
             </w:r>
             <w:r>
               <w:rPr>
@@ -1049,7 +1049,7 @@
               <w14:ligatures w14:val="standardContextual"/>
             </w:rPr>
           </w:pPr>
-          <w:hyperlink w:anchor="_Toc241429380" w:history="1">
+          <w:hyperlink w:anchor="_Toc241436982" w:history="1">
             <w:r>
               <w:rPr>
                 <w:rStyle w:val="a5"/>
@@ -1073,7 +1073,7 @@
               <w:rPr>
                 <w:noProof/>
               </w:rPr>
-              <w:instrText xml:space="preserve"> PAGEREF _Toc241429380 \h </w:instrText>
+              <w:instrText xml:space="preserve"> PAGEREF _Toc241436982 \h </w:instrText>
             </w:r>
             <w:r>
               <w:rPr>
@@ -1115,7 +1115,7 @@
               <w14:ligatures w14:val="standardContextual"/>
             </w:rPr>
           </w:pPr>
-          <w:hyperlink w:anchor="_Toc241429381" w:history="1">
+          <w:hyperlink w:anchor="_Toc241436983" w:history="1">
             <w:r>
               <w:rPr>
                 <w:rStyle w:val="a5"/>
@@ -1139,7 +1139,7 @@
               <w:rPr>
                 <w:noProof/>
               </w:rPr>
-              <w:instrText xml:space="preserve"> PAGEREF _Toc241429381 \h </w:instrText>
+              <w:instrText xml:space="preserve"> PAGEREF _Toc241436983 \h </w:instrText>
             </w:r>
             <w:r>
               <w:rPr>
@@ -1181,7 +1181,7 @@
               <w14:ligatures w14:val="standardContextual"/>
             </w:rPr>
           </w:pPr>
-          <w:hyperlink w:anchor="_Toc241429382" w:history="1">
+          <w:hyperlink w:anchor="_Toc241436984" w:history="1">
             <w:r>
               <w:rPr>
                 <w:rStyle w:val="a5"/>
@@ -1205,7 +1205,7 @@
               <w:rPr>
                 <w:noProof/>
               </w:rPr>
-              <w:instrText xml:space="preserve"> PAGEREF _Toc241429382 \h </w:instrText>
+              <w:instrText xml:space="preserve"> PAGEREF _Toc241436984 \h </w:instrText>
             </w:r>
             <w:r>
               <w:rPr>
@@ -1247,7 +1247,7 @@
               <w14:ligatures w14:val="standardContextual"/>
             </w:rPr>
           </w:pPr>
-          <w:hyperlink w:anchor="_Toc241429383" w:history="1">
+          <w:hyperlink w:anchor="_Toc241436985" w:history="1">
             <w:r>
               <w:rPr>
                 <w:rStyle w:val="a5"/>
@@ -1271,7 +1271,7 @@
               <w:rPr>
                 <w:noProof/>
               </w:rPr>
-              <w:instrText xml:space="preserve"> PAGEREF _Toc241429383 \h </w:instrText>
+              <w:instrText xml:space="preserve"> PAGEREF _Toc241436985 \h </w:instrText>
             </w:r>
             <w:r>
               <w:rPr>
@@ -1313,7 +1313,7 @@
               <w14:ligatures w14:val="standardContextual"/>
             </w:rPr>
           </w:pPr>
-          <w:hyperlink w:anchor="_Toc241429384" w:history="1">
+          <w:hyperlink w:anchor="_Toc241436986" w:history="1">
             <w:r>
               <w:rPr>
                 <w:rStyle w:val="a5"/>
@@ -1337,7 +1337,7 @@
               <w:rPr>
                 <w:noProof/>
               </w:rPr>
-              <w:instrText xml:space="preserve"> PAGEREF _Toc241429384 \h </w:instrText>
+              <w:instrText xml:space="preserve"> PAGEREF _Toc241436986 \h </w:instrText>
             </w:r>
             <w:r>
               <w:rPr>
@@ -1379,7 +1379,7 @@
               <w14:ligatures w14:val="standardContextual"/>
             </w:rPr>
           </w:pPr>
-          <w:hyperlink w:anchor="_Toc241429385" w:history="1">
+          <w:hyperlink w:anchor="_Toc241436987" w:history="1">
             <w:r>
               <w:rPr>
                 <w:rStyle w:val="a5"/>
@@ -1403,7 +1403,7 @@
               <w:rPr>
                 <w:noProof/>
               </w:rPr>
-              <w:instrText xml:space="preserve"> PAGEREF _Toc241429385 \h </w:instrText>
+              <w:instrText xml:space="preserve"> PAGEREF _Toc241436987 \h </w:instrText>
             </w:r>
             <w:r>
               <w:rPr>
@@ -1445,7 +1445,7 @@
               <w14:ligatures w14:val="standardContextual"/>
             </w:rPr>
           </w:pPr>
-          <w:hyperlink w:anchor="_Toc241429386" w:history="1">
+          <w:hyperlink w:anchor="_Toc241436988" w:history="1">
             <w:r>
               <w:rPr>
                 <w:rStyle w:val="a5"/>
@@ -1469,7 +1469,7 @@
               <w:rPr>
                 <w:noProof/>
               </w:rPr>
-              <w:instrText xml:space="preserve"> PAGEREF _Toc241429386 \h </w:instrText>
+              <w:instrText xml:space="preserve"> PAGEREF _Toc241436988 \h </w:instrText>
             </w:r>
             <w:r>
               <w:rPr>
@@ -1511,7 +1511,7 @@
               <w14:ligatures w14:val="standardContextual"/>
             </w:rPr>
           </w:pPr>
-          <w:hyperlink w:anchor="_Toc241429387" w:history="1">
+          <w:hyperlink w:anchor="_Toc241436989" w:history="1">
             <w:r>
               <w:rPr>
                 <w:rStyle w:val="a5"/>
@@ -1535,7 +1535,7 @@
               <w:rPr>
                 <w:noProof/>
               </w:rPr>
-              <w:instrText xml:space="preserve"> PAGEREF _Toc241429387 \h </w:instrText>
+              <w:instrText xml:space="preserve"> PAGEREF _Toc241436989 \h </w:instrText>
             </w:r>
             <w:r>
               <w:rPr>
@@ -1577,7 +1577,7 @@
               <w14:ligatures w14:val="standardContextual"/>
             </w:rPr>
           </w:pPr>
-          <w:hyperlink w:anchor="_Toc241429388" w:history="1">
+          <w:hyperlink w:anchor="_Toc241436990" w:history="1">
             <w:r>
               <w:rPr>
                 <w:rStyle w:val="a5"/>
@@ -1601,7 +1601,7 @@
               <w:rPr>
                 <w:noProof/>
               </w:rPr>
-              <w:instrText xml:space="preserve"> PAGEREF _Toc241429388 \h </w:instrText>
+              <w:instrText xml:space="preserve"> PAGEREF _Toc241436990 \h </w:instrText>
             </w:r>
             <w:r>
               <w:rPr>
@@ -1643,7 +1643,7 @@
               <w14:ligatures w14:val="standardContextual"/>
             </w:rPr>
           </w:pPr>
-          <w:hyperlink w:anchor="_Toc241429389" w:history="1">
+          <w:hyperlink w:anchor="_Toc241436991" w:history="1">
             <w:r>
               <w:rPr>
                 <w:rStyle w:val="a5"/>
@@ -1667,7 +1667,7 @@
               <w:rPr>
                 <w:noProof/>
               </w:rPr>
-              <w:instrText xml:space="preserve"> PAGEREF _Toc241429389 \h </w:instrText>
+              <w:instrText xml:space="preserve"> PAGEREF _Toc241436991 \h </w:instrText>
             </w:r>
             <w:r>
               <w:rPr>
@@ -1709,7 +1709,7 @@
               <w14:ligatures w14:val="standardContextual"/>
             </w:rPr>
           </w:pPr>
-          <w:hyperlink w:anchor="_Toc241429390" w:history="1">
+          <w:hyperlink w:anchor="_Toc241436992" w:history="1">
             <w:r>
               <w:rPr>
                 <w:rStyle w:val="a5"/>
@@ -1733,7 +1733,7 @@
               <w:rPr>
                 <w:noProof/>
               </w:rPr>
-              <w:instrText xml:space="preserve"> PAGEREF _Toc241429390 \h </w:instrText>
+              <w:instrText xml:space="preserve"> PAGEREF _Toc241436992 \h </w:instrText>
             </w:r>
             <w:r>
               <w:rPr>
@@ -1787,7 +1787,7 @@
         <w:keepNext/>
         <w:pageBreakBefore/>
       </w:pPr>
-      <w:bookmarkStart w:id="0" w:name="_Toc241429366"/>
+      <w:bookmarkStart w:id="0" w:name="_Toc241436968"/>
       <w:r>
         <w:lastRenderedPageBreak/>
         <w:t>1. Общие сведения</w:t>
@@ -1799,7 +1799,7 @@
         <w:pStyle w:val="2"/>
         <w:keepNext/>
       </w:pPr>
-      <w:bookmarkStart w:id="1" w:name="_Toc241429367"/>
+      <w:bookmarkStart w:id="1" w:name="_Toc241436969"/>
       <w:r>
         <w:t>1.1. Наименование</w:t>
       </w:r>
@@ -1829,7 +1829,7 @@
         <w:pStyle w:val="2"/>
         <w:keepNext/>
       </w:pPr>
-      <w:bookmarkStart w:id="2" w:name="_Toc241429368"/>
+      <w:bookmarkStart w:id="2" w:name="_Toc241436970"/>
       <w:r>
         <w:t>1.2. Заказчик и исполнитель</w:t>
       </w:r>
@@ -2231,7 +2231,7 @@
         <w:pStyle w:val="2"/>
         <w:keepNext/>
       </w:pPr>
-      <w:bookmarkStart w:id="3" w:name="_Toc241429369"/>
+      <w:bookmarkStart w:id="3" w:name="_Toc241436971"/>
       <w:r>
         <w:t>1.3. Основание для разработки</w:t>
       </w:r>
@@ -2243,7 +2243,7 @@
         <w:jc w:val="both"/>
       </w:pPr>
       <w:r>
-        <w:t xml:space="preserve">Базовая архитектура ТСЛ (ArchiMate, файл </w:t>
+        <w:t xml:space="preserve">Базовая архитектура ТСЛ (ArchiMate, </w:t>
       </w:r>
       <w:r>
         <w:rPr>
@@ -2252,6 +2252,17 @@
           <w:szCs w:val="20"/>
         </w:rPr>
         <w:t>base-architecture.drawio</w:t>
+      </w:r>
+      <w:r>
+        <w:t xml:space="preserve">; детализация модуля авторизации — </w:t>
+      </w:r>
+      <w:r>
+        <w:rPr>
+          <w:rFonts w:ascii="Consolas" w:eastAsia="Consolas" w:hAnsi="Consolas" w:cs="Consolas"/>
+          <w:sz w:val="20"/>
+          <w:szCs w:val="20"/>
+        </w:rPr>
+        <w:t>auth-architecture.drawio</w:t>
       </w:r>
       <w:r>
         <w:t>): в прикладном слое предусмотрен компонент «Авторизатор», обслуживающий пользовательский интерфейс, загрузчик файлов и бэкенд. Настоящее ТЗ определяет требования к этому компоненту.</w:t>
@@ -2268,8 +2279,8 @@
           <w:noProof/>
         </w:rPr>
         <w:drawing>
-          <wp:inline distT="0" distB="0" distL="0" distR="0" wp14:anchorId="3E1D2279" wp14:editId="7EC04D40">
-            <wp:extent cx="5991225" cy="4953000"/>
+          <wp:inline distT="0" distB="0" distL="0" distR="0" wp14:anchorId="2F1CC450" wp14:editId="7DA41071">
+            <wp:extent cx="5886450" cy="4953000"/>
             <wp:effectExtent l="0" t="0" r="0" b="0"/>
             <wp:docPr id="1" name="page1.png" descr="Базовая архитектура ТСЛ: Авторизатор реализован сервисом TSL Auth" title="Базовая архитектура ТСЛ: Авторизатор реализован сервисом TSL Auth"/>
             <wp:cNvGraphicFramePr>
@@ -2294,7 +2305,7 @@
                   <pic:spPr bwMode="auto">
                     <a:xfrm>
                       <a:off x="0" y="0"/>
-                      <a:ext cx="5991225" cy="4953000"/>
+                      <a:ext cx="5886450" cy="4953000"/>
                     </a:xfrm>
                     <a:prstGeom prst="rect">
                       <a:avLst/>
@@ -2327,7 +2338,7 @@
         <w:pStyle w:val="2"/>
         <w:keepNext/>
       </w:pPr>
-      <w:bookmarkStart w:id="4" w:name="_Toc241429370"/>
+      <w:bookmarkStart w:id="4" w:name="_Toc241436972"/>
       <w:r>
         <w:lastRenderedPageBreak/>
         <w:t>1.4. Плановые сроки</w:t>
@@ -3054,7 +3065,7 @@
         <w:pStyle w:val="2"/>
         <w:keepNext/>
       </w:pPr>
-      <w:bookmarkStart w:id="5" w:name="_Toc241429371"/>
+      <w:bookmarkStart w:id="5" w:name="_Toc241436973"/>
       <w:r>
         <w:t>1.5. Термины и сокращения</w:t>
       </w:r>
@@ -3838,7 +3849,7 @@
         <w:keepNext/>
         <w:pageBreakBefore/>
       </w:pPr>
-      <w:bookmarkStart w:id="6" w:name="_Toc241429372"/>
+      <w:bookmarkStart w:id="6" w:name="_Toc241436974"/>
       <w:r>
         <w:lastRenderedPageBreak/>
         <w:t>2. Назначение и цели создания</w:t>
@@ -3850,7 +3861,7 @@
         <w:pStyle w:val="2"/>
         <w:keepNext/>
       </w:pPr>
-      <w:bookmarkStart w:id="7" w:name="_Toc241429373"/>
+      <w:bookmarkStart w:id="7" w:name="_Toc241436975"/>
       <w:r>
         <w:t>2.1. Назначение</w:t>
       </w:r>
@@ -3870,7 +3881,7 @@
         <w:pStyle w:val="2"/>
         <w:keepNext/>
       </w:pPr>
-      <w:bookmarkStart w:id="8" w:name="_Toc241429374"/>
+      <w:bookmarkStart w:id="8" w:name="_Toc241436976"/>
       <w:r>
         <w:t>2.2. Цели</w:t>
       </w:r>
@@ -3946,7 +3957,7 @@
         <w:pStyle w:val="2"/>
         <w:keepNext/>
       </w:pPr>
-      <w:bookmarkStart w:id="9" w:name="_Toc241429375"/>
+      <w:bookmarkStart w:id="9" w:name="_Toc241436977"/>
       <w:r>
         <w:t>2.3. Ограничения заказчика</w:t>
       </w:r>
@@ -4009,7 +4020,7 @@
         <w:pStyle w:val="2"/>
         <w:keepNext/>
       </w:pPr>
-      <w:bookmarkStart w:id="10" w:name="_Toc241429376"/>
+      <w:bookmarkStart w:id="10" w:name="_Toc241436978"/>
       <w:r>
         <w:t>2.4. Критерии достижения целей</w:t>
       </w:r>
@@ -4073,7 +4084,7 @@
         <w:keepNext/>
         <w:pageBreakBefore/>
       </w:pPr>
-      <w:bookmarkStart w:id="11" w:name="_Toc241429377"/>
+      <w:bookmarkStart w:id="11" w:name="_Toc241436979"/>
       <w:r>
         <w:lastRenderedPageBreak/>
         <w:t>3. Характеристика объекта автоматизации</w:t>
@@ -4085,7 +4096,7 @@
         <w:pStyle w:val="2"/>
         <w:keepNext/>
       </w:pPr>
-      <w:bookmarkStart w:id="12" w:name="_Toc241429378"/>
+      <w:bookmarkStart w:id="12" w:name="_Toc241436980"/>
       <w:r>
         <w:t>3.1. Участники и системы</w:t>
       </w:r>
@@ -4111,10 +4122,10 @@
           <w:noProof/>
         </w:rPr>
         <w:drawing>
-          <wp:inline distT="0" distB="0" distL="0" distR="0" wp14:anchorId="32609387" wp14:editId="3E085E83">
+          <wp:inline distT="0" distB="0" distL="0" distR="0" wp14:anchorId="1A17C806" wp14:editId="1D614328">
             <wp:extent cx="5905500" cy="4086225"/>
             <wp:effectExtent l="0" t="0" r="0" b="0"/>
-            <wp:docPr id="2075600021" name="d01.png" descr="Контекст: кто и как обращается к TSL Auth" title="Контекст: кто и как обращается к TSL Auth"/>
+            <wp:docPr id="552456807" name="d01.png" descr="Контекст: кто и как обращается к TSL Auth" title="Контекст: кто и как обращается к TSL Auth"/>
             <wp:cNvGraphicFramePr>
               <a:graphicFrameLocks xmlns:a="http://schemas.openxmlformats.org/drawingml/2006/main" noChangeAspect="1"/>
             </wp:cNvGraphicFramePr>
@@ -4612,7 +4623,7 @@
         <w:pStyle w:val="2"/>
         <w:keepNext/>
       </w:pPr>
-      <w:bookmarkStart w:id="13" w:name="_Toc241429379"/>
+      <w:bookmarkStart w:id="13" w:name="_Toc241436981"/>
       <w:r>
         <w:lastRenderedPageBreak/>
         <w:t>3.2. Прикладная архитектура</w:t>
@@ -4630,10 +4641,10 @@
           <w:noProof/>
         </w:rPr>
         <w:drawing>
-          <wp:inline distT="0" distB="0" distL="0" distR="0" wp14:anchorId="621E9178" wp14:editId="49BF862E">
+          <wp:inline distT="0" distB="0" distL="0" distR="0" wp14:anchorId="375A191E" wp14:editId="16826799">
             <wp:extent cx="6096000" cy="3981450"/>
             <wp:effectExtent l="0" t="0" r="0" b="0"/>
-            <wp:docPr id="1745707699" name="page2.png" descr="TSL Auth: прикладной уровень (ArchiMate)" title="TSL Auth: прикладной уровень (ArchiMate)"/>
+            <wp:docPr id="102003340" name="page2.png" descr="TSL Auth: прикладной уровень (ArchiMate)" title="TSL Auth: прикладной уровень (ArchiMate)"/>
             <wp:cNvGraphicFramePr>
               <a:graphicFrameLocks xmlns:a="http://schemas.openxmlformats.org/drawingml/2006/main" noChangeAspect="1"/>
             </wp:cNvGraphicFramePr>
@@ -4690,7 +4701,7 @@
         <w:keepNext/>
         <w:pageBreakBefore/>
       </w:pPr>
-      <w:bookmarkStart w:id="14" w:name="_Toc241429380"/>
+      <w:bookmarkStart w:id="14" w:name="_Toc241436982"/>
       <w:r>
         <w:lastRenderedPageBreak/>
         <w:t>4. Требования к системе</w:t>
@@ -4702,7 +4713,7 @@
         <w:pStyle w:val="2"/>
         <w:keepNext/>
       </w:pPr>
-      <w:bookmarkStart w:id="15" w:name="_Toc241429381"/>
+      <w:bookmarkStart w:id="15" w:name="_Toc241436983"/>
       <w:r>
         <w:t>4.1. Требования к структуре</w:t>
       </w:r>
@@ -4719,10 +4730,10 @@
           <w:noProof/>
         </w:rPr>
         <w:drawing>
-          <wp:inline distT="0" distB="0" distL="0" distR="0" wp14:anchorId="538B6787" wp14:editId="260F9790">
+          <wp:inline distT="0" distB="0" distL="0" distR="0" wp14:anchorId="23CD07F0" wp14:editId="0BB6543D">
             <wp:extent cx="2466975" cy="4381500"/>
             <wp:effectExtent l="0" t="0" r="0" b="0"/>
-            <wp:docPr id="1560282537" name="d02.png" descr="Компоненты контейнера TSL Auth" title="Компоненты контейнера TSL Auth"/>
+            <wp:docPr id="449736629" name="d02.png" descr="Компоненты контейнера TSL Auth" title="Компоненты контейнера TSL Auth"/>
             <wp:cNvGraphicFramePr>
               <a:graphicFrameLocks xmlns:a="http://schemas.openxmlformats.org/drawingml/2006/main" noChangeAspect="1"/>
             </wp:cNvGraphicFramePr>
@@ -5458,7 +5469,7 @@
         <w:pStyle w:val="2"/>
         <w:keepNext/>
       </w:pPr>
-      <w:bookmarkStart w:id="16" w:name="_Toc241429382"/>
+      <w:bookmarkStart w:id="16" w:name="_Toc241436984"/>
       <w:r>
         <w:lastRenderedPageBreak/>
         <w:t>4.2. Функциональные требования</w:t>
@@ -5972,10 +5983,10 @@
           <w:noProof/>
         </w:rPr>
         <w:drawing>
-          <wp:inline distT="0" distB="0" distL="0" distR="0" wp14:anchorId="3F3629E8" wp14:editId="1BF284C5">
+          <wp:inline distT="0" distB="0" distL="0" distR="0" wp14:anchorId="6CCA57AA" wp14:editId="2991F4BE">
             <wp:extent cx="5334000" cy="3248025"/>
             <wp:effectExtent l="0" t="0" r="0" b="0"/>
-            <wp:docPr id="2121763426" name="d03.png" descr="Вход пользователя: authorization code + PKCE" title="Вход пользователя: authorization code + PKCE"/>
+            <wp:docPr id="939330468" name="d03.png" descr="Вход пользователя: authorization code + PKCE" title="Вход пользователя: authorization code + PKCE"/>
             <wp:cNvGraphicFramePr>
               <a:graphicFrameLocks xmlns:a="http://schemas.openxmlformats.org/drawingml/2006/main" noChangeAspect="1"/>
             </wp:cNvGraphicFramePr>
@@ -6037,10 +6048,10 @@
           <w:noProof/>
         </w:rPr>
         <w:drawing>
-          <wp:inline distT="0" distB="0" distL="0" distR="0" wp14:anchorId="41DC4B17" wp14:editId="3B397CCF">
+          <wp:inline distT="0" distB="0" distL="0" distR="0" wp14:anchorId="5F66EAB9" wp14:editId="0A47A2E9">
             <wp:extent cx="4953000" cy="2447925"/>
             <wp:effectExtent l="0" t="0" r="0" b="0"/>
-            <wp:docPr id="1009150540" name="d04.png" descr="Сервис → сервис: client credentials и token exchange" title="Сервис → сервис: client credentials и token exchange"/>
+            <wp:docPr id="1082608124" name="d04.png" descr="Сервис → сервис: client credentials и token exchange" title="Сервис → сервис: client credentials и token exchange"/>
             <wp:cNvGraphicFramePr>
               <a:graphicFrameLocks xmlns:a="http://schemas.openxmlformats.org/drawingml/2006/main" noChangeAspect="1"/>
             </wp:cNvGraphicFramePr>
@@ -6503,10 +6514,10 @@
           <w:noProof/>
         </w:rPr>
         <w:drawing>
-          <wp:inline distT="0" distB="0" distL="0" distR="0" wp14:anchorId="2775E7AB" wp14:editId="7145561F">
+          <wp:inline distT="0" distB="0" distL="0" distR="0" wp14:anchorId="7941871A" wp14:editId="61E8F511">
             <wp:extent cx="3019425" cy="3048000"/>
             <wp:effectExtent l="0" t="0" r="0" b="0"/>
-            <wp:docPr id="1267217420" name="d05.png" descr="Модель прав" title="Модель прав"/>
+            <wp:docPr id="938353837" name="d05.png" descr="Модель прав" title="Модель прав"/>
             <wp:cNvGraphicFramePr>
               <a:graphicFrameLocks xmlns:a="http://schemas.openxmlformats.org/drawingml/2006/main" noChangeAspect="1"/>
             </wp:cNvGraphicFramePr>
@@ -7020,10 +7031,10 @@
         </w:rPr>
         <w:lastRenderedPageBreak/>
         <w:drawing>
-          <wp:inline distT="0" distB="0" distL="0" distR="0" wp14:anchorId="0C05DCA6" wp14:editId="57EE89AB">
+          <wp:inline distT="0" distB="0" distL="0" distR="0" wp14:anchorId="410E7A7F" wp14:editId="637E3480">
             <wp:extent cx="4953000" cy="2667000"/>
             <wp:effectExtent l="0" t="0" r="0" b="0"/>
-            <wp:docPr id="29199911" name="d06.png" descr="Жизненный цикл учётной записи" title="Жизненный цикл учётной записи"/>
+            <wp:docPr id="1168544544" name="d06.png" descr="Жизненный цикл учётной записи" title="Жизненный цикл учётной записи"/>
             <wp:cNvGraphicFramePr>
               <a:graphicFrameLocks xmlns:a="http://schemas.openxmlformats.org/drawingml/2006/main" noChangeAspect="1"/>
             </wp:cNvGraphicFramePr>
@@ -7625,10 +7636,10 @@
           <w:noProof/>
         </w:rPr>
         <w:drawing>
-          <wp:inline distT="0" distB="0" distL="0" distR="0" wp14:anchorId="75245C41" wp14:editId="0EF4227A">
+          <wp:inline distT="0" distB="0" distL="0" distR="0" wp14:anchorId="7BB0EE95" wp14:editId="4DBDD366">
             <wp:extent cx="5334000" cy="3028950"/>
             <wp:effectExtent l="0" t="0" r="0" b="0"/>
-            <wp:docPr id="1220611748" name="d07.png" descr="Блокировка учётной записи через бота безопасности" title="Блокировка учётной записи через бота безопасности"/>
+            <wp:docPr id="1869610407" name="d07.png" descr="Блокировка учётной записи через бота безопасности" title="Блокировка учётной записи через бота безопасности"/>
             <wp:cNvGraphicFramePr>
               <a:graphicFrameLocks xmlns:a="http://schemas.openxmlformats.org/drawingml/2006/main" noChangeAspect="1"/>
             </wp:cNvGraphicFramePr>
@@ -8123,7 +8134,7 @@
         <w:pStyle w:val="2"/>
         <w:keepNext/>
       </w:pPr>
-      <w:bookmarkStart w:id="17" w:name="_Toc241429383"/>
+      <w:bookmarkStart w:id="17" w:name="_Toc241436985"/>
       <w:r>
         <w:t>4.3. Требования к надёжности</w:t>
       </w:r>
@@ -8703,10 +8714,10 @@
         </w:rPr>
         <w:lastRenderedPageBreak/>
         <w:drawing>
-          <wp:inline distT="0" distB="0" distL="0" distR="0" wp14:anchorId="46DB5559" wp14:editId="6766058E">
+          <wp:inline distT="0" distB="0" distL="0" distR="0" wp14:anchorId="0663C0E8" wp14:editId="3BEC3762">
             <wp:extent cx="2695575" cy="4953000"/>
             <wp:effectExtent l="0" t="0" r="0" b="0"/>
-            <wp:docPr id="638270195" name="d08.png" descr="Обновление и самовосстановление схемы БД при старте" title="Обновление и самовосстановление схемы БД при старте"/>
+            <wp:docPr id="1880273297" name="d08.png" descr="Обновление и самовосстановление схемы БД при старте" title="Обновление и самовосстановление схемы БД при старте"/>
             <wp:cNvGraphicFramePr>
               <a:graphicFrameLocks xmlns:a="http://schemas.openxmlformats.org/drawingml/2006/main" noChangeAspect="1"/>
             </wp:cNvGraphicFramePr>
@@ -9270,7 +9281,7 @@
         <w:pStyle w:val="2"/>
         <w:keepNext/>
       </w:pPr>
-      <w:bookmarkStart w:id="18" w:name="_Toc241429384"/>
+      <w:bookmarkStart w:id="18" w:name="_Toc241436986"/>
       <w:r>
         <w:t>4.4. Требования к производительности</w:t>
       </w:r>
@@ -9807,7 +9818,7 @@
         <w:pStyle w:val="2"/>
         <w:keepNext/>
       </w:pPr>
-      <w:bookmarkStart w:id="19" w:name="_Toc241429385"/>
+      <w:bookmarkStart w:id="19" w:name="_Toc241436987"/>
       <w:r>
         <w:t>4.5. Требования к безопасности</w:t>
       </w:r>
@@ -10511,7 +10522,7 @@
         <w:pStyle w:val="2"/>
         <w:keepNext/>
       </w:pPr>
-      <w:bookmarkStart w:id="20" w:name="_Toc241429386"/>
+      <w:bookmarkStart w:id="20" w:name="_Toc241436988"/>
       <w:r>
         <w:t>4.6. Требования к развёртыванию</w:t>
       </w:r>
@@ -10528,10 +10539,10 @@
           <w:noProof/>
         </w:rPr>
         <w:drawing>
-          <wp:inline distT="0" distB="0" distL="0" distR="0" wp14:anchorId="4FF00AB3" wp14:editId="46D7675E">
+          <wp:inline distT="0" distB="0" distL="0" distR="0" wp14:anchorId="70157FCB" wp14:editId="03D47CBF">
             <wp:extent cx="3800475" cy="2857500"/>
             <wp:effectExtent l="0" t="0" r="0" b="0"/>
-            <wp:docPr id="1736667233" name="d09.png" descr="Варианты развёртывания" title="Варианты развёртывания"/>
+            <wp:docPr id="895845569" name="d09.png" descr="Варианты развёртывания" title="Варианты развёртывания"/>
             <wp:cNvGraphicFramePr>
               <a:graphicFrameLocks xmlns:a="http://schemas.openxmlformats.org/drawingml/2006/main" noChangeAspect="1"/>
             </wp:cNvGraphicFramePr>
@@ -10594,10 +10605,10 @@
         </w:rPr>
         <w:lastRenderedPageBreak/>
         <w:drawing>
-          <wp:inline distT="0" distB="0" distL="0" distR="0" wp14:anchorId="50A56208" wp14:editId="73AEA16C">
+          <wp:inline distT="0" distB="0" distL="0" distR="0" wp14:anchorId="09C25161" wp14:editId="7EB8AD3B">
             <wp:extent cx="6096000" cy="3181350"/>
             <wp:effectExtent l="0" t="0" r="0" b="0"/>
-            <wp:docPr id="1014955252" name="page3.png" descr="TSL Auth: развёртывание (ArchiMate)" title="TSL Auth: развёртывание (ArchiMate)"/>
+            <wp:docPr id="813956907" name="page3.png" descr="TSL Auth: развёртывание (ArchiMate)" title="TSL Auth: развёртывание (ArchiMate)"/>
             <wp:cNvGraphicFramePr>
               <a:graphicFrameLocks xmlns:a="http://schemas.openxmlformats.org/drawingml/2006/main" noChangeAspect="1"/>
             </wp:cNvGraphicFramePr>
@@ -10659,10 +10670,10 @@
           <w:noProof/>
         </w:rPr>
         <w:drawing>
-          <wp:inline distT="0" distB="0" distL="0" distR="0" wp14:anchorId="0D73A83E" wp14:editId="290A1DAE">
+          <wp:inline distT="0" distB="0" distL="0" distR="0" wp14:anchorId="0DDABD14" wp14:editId="1B94597F">
             <wp:extent cx="5715000" cy="1838325"/>
             <wp:effectExtent l="0" t="0" r="0" b="0"/>
-            <wp:docPr id="140753216" name="d11.png" descr="Секреты из OpenBao: инициализация, AppRole, чтение при старте" title="Секреты из OpenBao: инициализация, AppRole, чтение при старте"/>
+            <wp:docPr id="313201906" name="d11.png" descr="Секреты из OpenBao: инициализация, AppRole, чтение при старте" title="Секреты из OpenBao: инициализация, AppRole, чтение при старте"/>
             <wp:cNvGraphicFramePr>
               <a:graphicFrameLocks xmlns:a="http://schemas.openxmlformats.org/drawingml/2006/main" noChangeAspect="1"/>
             </wp:cNvGraphicFramePr>
@@ -11384,7 +11395,7 @@
         <w:pStyle w:val="2"/>
         <w:keepNext/>
       </w:pPr>
-      <w:bookmarkStart w:id="21" w:name="_Toc241429387"/>
+      <w:bookmarkStart w:id="21" w:name="_Toc241436989"/>
       <w:r>
         <w:t>4.7. Требования к интеграции</w:t>
       </w:r>
@@ -11480,7 +11491,7 @@
         <w:keepNext/>
         <w:pageBreakBefore/>
       </w:pPr>
-      <w:bookmarkStart w:id="22" w:name="_Toc241429388"/>
+      <w:bookmarkStart w:id="22" w:name="_Toc241436990"/>
       <w:r>
         <w:lastRenderedPageBreak/>
         <w:t>5. Состав и содержание работ</w:t>
@@ -11498,10 +11509,10 @@
           <w:noProof/>
         </w:rPr>
         <w:drawing>
-          <wp:inline distT="0" distB="0" distL="0" distR="0" wp14:anchorId="042156CF" wp14:editId="0E0BF854">
+          <wp:inline distT="0" distB="0" distL="0" distR="0" wp14:anchorId="253A1D94" wp14:editId="418D7255">
             <wp:extent cx="5905500" cy="695325"/>
             <wp:effectExtent l="0" t="0" r="0" b="0"/>
-            <wp:docPr id="1666793817" name="d10.png" descr="Конвейер поставки" title="Конвейер поставки"/>
+            <wp:docPr id="1318756854" name="d10.png" descr="Конвейер поставки" title="Конвейер поставки"/>
             <wp:cNvGraphicFramePr>
               <a:graphicFrameLocks xmlns:a="http://schemas.openxmlformats.org/drawingml/2006/main" noChangeAspect="1"/>
             </wp:cNvGraphicFramePr>
@@ -11934,7 +11945,7 @@
         <w:keepNext/>
         <w:pageBreakBefore/>
       </w:pPr>
-      <w:bookmarkStart w:id="23" w:name="_Toc241429389"/>
+      <w:bookmarkStart w:id="23" w:name="_Toc241436991"/>
       <w:r>
         <w:lastRenderedPageBreak/>
         <w:t>6. Порядок контроля и приёмки</w:t>
@@ -12861,7 +12872,7 @@
         <w:keepNext/>
         <w:pageBreakBefore/>
       </w:pPr>
-      <w:bookmarkStart w:id="24" w:name="_Toc241429390"/>
+      <w:bookmarkStart w:id="24" w:name="_Toc241436992"/>
       <w:r>
         <w:lastRenderedPageBreak/>
         <w:t>7. Требования к документированию</w:t>
@@ -13341,7 +13352,7 @@
                 <w:sz w:val="19"/>
                 <w:szCs w:val="19"/>
               </w:rPr>
-              <w:t>ArchiMate-модель</w:t>
+              <w:t>ArchiMate-модель модуля авторизации</w:t>
             </w:r>
           </w:p>
         </w:tc>
@@ -13370,7 +13381,7 @@
                 <w:sz w:val="19"/>
                 <w:szCs w:val="19"/>
               </w:rPr>
-              <w:t>docs/archimate/base-architecture.drawio</w:t>
+              <w:t>docs/archimate/auth-architecture.drawio</w:t>
             </w:r>
           </w:p>
         </w:tc>
@@ -13493,10 +13504,64 @@
 <file path=word/numbering.xml><?xml version="1.0" encoding="utf-8"?>
 <w:numbering xmlns:wpc="http://schemas.microsoft.com/office/word/2010/wordprocessingCanvas" xmlns:cx="http://schemas.microsoft.com/office/drawing/2014/chartex" xmlns:cx1="http://schemas.microsoft.com/office/drawing/2015/9/8/chartex" xmlns:cx2="http://schemas.microsoft.com/office/drawing/2015/10/21/chartex" xmlns:cx3="http://schemas.microsoft.com/office/drawing/2016/5/9/chartex" xmlns:cx4="http://schemas.microsoft.com/office/drawing/2016/5/10/chartex" xmlns:cx5="http://schemas.microsoft.com/office/drawing/2016/5/11/chartex" xmlns:cx6="http://schemas.microsoft.com/office/drawing/2016/5/12/chartex" xmlns:cx7="http://schemas.microsoft.com/office/drawing/2016/5/13/chartex" xmlns:cx8="http://schemas.microsoft.com/office/drawing/2016/5/14/chartex" xmlns:mc="http://schemas.openxmlformats.org/markup-compatibility/2006" xmlns:aink="http://schemas.microsoft.com/office/drawing/2016/ink" xmlns:am3d="http://schemas.microsoft.com/office/drawing/2017/model3d" xmlns:o="urn:schemas-microsoft-com:office:office" xmlns:oel="http://schemas.microsoft.com/office/2019/extlst" xmlns:r="http://schemas.openxmlformats.org/officeDocument/2006/relationships" xmlns:m="http://schemas.openxmlformats.org/officeDocument/2006/math" xmlns:v="urn:schemas-microsoft-com:vml" xmlns:wp14="http://schemas.microsoft.com/office/word/2010/wordprocessingDrawing" xmlns:wp="http://schemas.openxmlformats.org/drawingml/2006/wordprocessingDrawing" xmlns:w10="urn:schemas-microsoft-com:office:word" xmlns:w="http://schemas.openxmlformats.org/wordprocessingml/2006/main" xmlns:w14="http://schemas.microsoft.com/office/word/2010/wordml" xmlns:w15="http://schemas.microsoft.com/office/word/2012/wordml" xmlns:w16cex="http://schemas.microsoft.com/office/word/2018/wordml/cex" xmlns:w16cid="http://schemas.microsoft.com/office/word/2016/wordml/cid" xmlns:w16="http://schemas.microsoft.com/office/word/2018/wordml" xmlns:w16du="http://schemas.microsoft.com/office/word/2023/wordml/word16du" xmlns:w16sdtdh="http://schemas.microsoft.com/office/word/2020/wordml/sdtdatahash" xmlns:w16sdtfl="http://schemas.microsoft.com/office/word/2024/wordml/sdtformatlock" xmlns:w16se="http://schemas.microsoft.com/office/word/2015/wordml/symex" xmlns:wpg="http://schemas.microsoft.com/office/word/2010/wordprocessingGroup" xmlns:wpi="http://schemas.microsoft.com/office/word/2010/wordprocessingInk" xmlns:wne="http://schemas.microsoft.com/office/word/2006/wordml" xmlns:wps="http://schemas.microsoft.com/office/word/2010/wordprocessingShape" mc:Ignorable="w14 w15 w16se w16cid w16 w16cex w16sdtdh w16sdtfl w16du wp14">
   <w:abstractNum w:abstractNumId="0" w15:restartNumberingAfterBreak="0">
-    <w:nsid w:val="122F5A75"/>
+    <w:nsid w:val="03B14C2B"/>
     <w:multiLevelType w:val="hybridMultilevel"/>
-    <w:tmpl w:val="14CE8B14"/>
-    <w:lvl w:ilvl="0" w:tplc="14E03222">
+    <w:tmpl w:val="ADEEF760"/>
+    <w:lvl w:ilvl="0" w:tplc="B9C2DD54">
+      <w:start w:val="1"/>
+      <w:numFmt w:val="bullet"/>
+      <w:lvlText w:val="–"/>
+      <w:lvlJc w:val="left"/>
+      <w:pPr>
+        <w:ind w:left="426" w:hanging="284"/>
+      </w:pPr>
+    </w:lvl>
+    <w:lvl w:ilvl="1" w:tplc="A10A8D18">
+      <w:numFmt w:val="decimal"/>
+      <w:lvlText w:val=""/>
+      <w:lvlJc w:val="left"/>
+    </w:lvl>
+    <w:lvl w:ilvl="2" w:tplc="3556921E">
+      <w:numFmt w:val="decimal"/>
+      <w:lvlText w:val=""/>
+      <w:lvlJc w:val="left"/>
+    </w:lvl>
+    <w:lvl w:ilvl="3" w:tplc="256017BC">
+      <w:numFmt w:val="decimal"/>
+      <w:lvlText w:val=""/>
+      <w:lvlJc w:val="left"/>
+    </w:lvl>
+    <w:lvl w:ilvl="4" w:tplc="CF7A0FA8">
+      <w:numFmt w:val="decimal"/>
+      <w:lvlText w:val=""/>
+      <w:lvlJc w:val="left"/>
+    </w:lvl>
+    <w:lvl w:ilvl="5" w:tplc="0922CDC2">
+      <w:numFmt w:val="decimal"/>
+      <w:lvlText w:val=""/>
+      <w:lvlJc w:val="left"/>
+    </w:lvl>
+    <w:lvl w:ilvl="6" w:tplc="04FE0692">
+      <w:numFmt w:val="decimal"/>
+      <w:lvlText w:val=""/>
+      <w:lvlJc w:val="left"/>
+    </w:lvl>
+    <w:lvl w:ilvl="7" w:tplc="8AF68E72">
+      <w:numFmt w:val="decimal"/>
+      <w:lvlText w:val=""/>
+      <w:lvlJc w:val="left"/>
+    </w:lvl>
+    <w:lvl w:ilvl="8" w:tplc="232E0912">
+      <w:numFmt w:val="decimal"/>
+      <w:lvlText w:val=""/>
+      <w:lvlJc w:val="left"/>
+    </w:lvl>
+  </w:abstractNum>
+  <w:abstractNum w:abstractNumId="1" w15:restartNumberingAfterBreak="0">
+    <w:nsid w:val="0ABF6F3E"/>
+    <w:multiLevelType w:val="hybridMultilevel"/>
+    <w:tmpl w:val="B62C6500"/>
+    <w:lvl w:ilvl="0" w:tplc="4A2E256E">
       <w:start w:val="1"/>
       <w:numFmt w:val="bullet"/>
       <w:lvlText w:val="●"/>
@@ -13505,7 +13570,7 @@
         <w:ind w:left="720" w:hanging="360"/>
       </w:pPr>
     </w:lvl>
-    <w:lvl w:ilvl="1" w:tplc="AA2AB7F0">
+    <w:lvl w:ilvl="1" w:tplc="797ADA8A">
       <w:start w:val="1"/>
       <w:numFmt w:val="bullet"/>
       <w:lvlText w:val="○"/>
@@ -13514,7 +13579,7 @@
         <w:ind w:left="1440" w:hanging="360"/>
       </w:pPr>
     </w:lvl>
-    <w:lvl w:ilvl="2" w:tplc="10669978">
+    <w:lvl w:ilvl="2" w:tplc="7AA6A710">
       <w:start w:val="1"/>
       <w:numFmt w:val="bullet"/>
       <w:lvlText w:val="■"/>
@@ -13523,7 +13588,7 @@
         <w:ind w:left="2160" w:hanging="360"/>
       </w:pPr>
     </w:lvl>
-    <w:lvl w:ilvl="3" w:tplc="0FC458FA">
+    <w:lvl w:ilvl="3" w:tplc="928A3584">
       <w:start w:val="1"/>
       <w:numFmt w:val="bullet"/>
       <w:lvlText w:val="●"/>
@@ -13532,7 +13597,7 @@
         <w:ind w:left="2880" w:hanging="360"/>
       </w:pPr>
     </w:lvl>
-    <w:lvl w:ilvl="4" w:tplc="ECF0785E">
+    <w:lvl w:ilvl="4" w:tplc="6562E4E6">
       <w:start w:val="1"/>
       <w:numFmt w:val="bullet"/>
       <w:lvlText w:val="○"/>
@@ -13541,7 +13606,7 @@
         <w:ind w:left="3600" w:hanging="360"/>
       </w:pPr>
     </w:lvl>
-    <w:lvl w:ilvl="5" w:tplc="478C3596">
+    <w:lvl w:ilvl="5" w:tplc="CE0AF7B2">
       <w:start w:val="1"/>
       <w:numFmt w:val="bullet"/>
       <w:lvlText w:val="■"/>
@@ -13550,7 +13615,7 @@
         <w:ind w:left="4320" w:hanging="360"/>
       </w:pPr>
     </w:lvl>
-    <w:lvl w:ilvl="6" w:tplc="24B0EED8">
+    <w:lvl w:ilvl="6" w:tplc="244A8BBE">
       <w:start w:val="1"/>
       <w:numFmt w:val="bullet"/>
       <w:lvlText w:val="●"/>
@@ -13559,7 +13624,7 @@
         <w:ind w:left="5040" w:hanging="360"/>
       </w:pPr>
     </w:lvl>
-    <w:lvl w:ilvl="7" w:tplc="81E83466">
+    <w:lvl w:ilvl="7" w:tplc="70584FAC">
       <w:start w:val="1"/>
       <w:numFmt w:val="bullet"/>
       <w:lvlText w:val="●"/>
@@ -13568,7 +13633,7 @@
         <w:ind w:left="5760" w:hanging="360"/>
       </w:pPr>
     </w:lvl>
-    <w:lvl w:ilvl="8" w:tplc="BE9C17EC">
+    <w:lvl w:ilvl="8" w:tplc="CEB69732">
       <w:start w:val="1"/>
       <w:numFmt w:val="bullet"/>
       <w:lvlText w:val="●"/>
@@ -13578,65 +13643,11 @@
       </w:pPr>
     </w:lvl>
   </w:abstractNum>
-  <w:abstractNum w:abstractNumId="1" w15:restartNumberingAfterBreak="0">
-    <w:nsid w:val="30572534"/>
+  <w:abstractNum w:abstractNumId="2" w15:restartNumberingAfterBreak="0">
+    <w:nsid w:val="4CA1782C"/>
     <w:multiLevelType w:val="hybridMultilevel"/>
-    <w:tmpl w:val="0FB25D28"/>
-    <w:lvl w:ilvl="0" w:tplc="2C726F44">
-      <w:start w:val="1"/>
-      <w:numFmt w:val="bullet"/>
-      <w:lvlText w:val="–"/>
-      <w:lvlJc w:val="left"/>
-      <w:pPr>
-        <w:ind w:left="426" w:hanging="284"/>
-      </w:pPr>
-    </w:lvl>
-    <w:lvl w:ilvl="1" w:tplc="01209026">
-      <w:numFmt w:val="decimal"/>
-      <w:lvlText w:val=""/>
-      <w:lvlJc w:val="left"/>
-    </w:lvl>
-    <w:lvl w:ilvl="2" w:tplc="85C0BD42">
-      <w:numFmt w:val="decimal"/>
-      <w:lvlText w:val=""/>
-      <w:lvlJc w:val="left"/>
-    </w:lvl>
-    <w:lvl w:ilvl="3" w:tplc="1E1C8D22">
-      <w:numFmt w:val="decimal"/>
-      <w:lvlText w:val=""/>
-      <w:lvlJc w:val="left"/>
-    </w:lvl>
-    <w:lvl w:ilvl="4" w:tplc="CC987EE6">
-      <w:numFmt w:val="decimal"/>
-      <w:lvlText w:val=""/>
-      <w:lvlJc w:val="left"/>
-    </w:lvl>
-    <w:lvl w:ilvl="5" w:tplc="C1D8F1D6">
-      <w:numFmt w:val="decimal"/>
-      <w:lvlText w:val=""/>
-      <w:lvlJc w:val="left"/>
-    </w:lvl>
-    <w:lvl w:ilvl="6" w:tplc="67102674">
-      <w:numFmt w:val="decimal"/>
-      <w:lvlText w:val=""/>
-      <w:lvlJc w:val="left"/>
-    </w:lvl>
-    <w:lvl w:ilvl="7" w:tplc="86DE6508">
-      <w:numFmt w:val="decimal"/>
-      <w:lvlText w:val=""/>
-      <w:lvlJc w:val="left"/>
-    </w:lvl>
-    <w:lvl w:ilvl="8" w:tplc="5D283CBA">
-      <w:numFmt w:val="decimal"/>
-      <w:lvlText w:val=""/>
-      <w:lvlJc w:val="left"/>
-    </w:lvl>
-  </w:abstractNum>
-  <w:abstractNum w:abstractNumId="2" w15:restartNumberingAfterBreak="0">
-    <w:nsid w:val="78E113F2"/>
-    <w:multiLevelType w:val="hybridMultilevel"/>
-    <w:tmpl w:val="C4406B96"/>
-    <w:lvl w:ilvl="0" w:tplc="B7B2BDC2">
+    <w:tmpl w:val="EBCE016C"/>
+    <w:lvl w:ilvl="0" w:tplc="F0F46CD2">
       <w:start w:val="1"/>
       <w:numFmt w:val="decimal"/>
       <w:lvlText w:val="%1."/>
@@ -13645,55 +13656,55 @@
         <w:ind w:left="426" w:hanging="284"/>
       </w:pPr>
     </w:lvl>
-    <w:lvl w:ilvl="1" w:tplc="71A660F6">
+    <w:lvl w:ilvl="1" w:tplc="45E01472">
       <w:numFmt w:val="decimal"/>
       <w:lvlText w:val=""/>
       <w:lvlJc w:val="left"/>
     </w:lvl>
-    <w:lvl w:ilvl="2" w:tplc="18D2A242">
+    <w:lvl w:ilvl="2" w:tplc="BE3462DC">
       <w:numFmt w:val="decimal"/>
       <w:lvlText w:val=""/>
       <w:lvlJc w:val="left"/>
     </w:lvl>
-    <w:lvl w:ilvl="3" w:tplc="69A41830">
+    <w:lvl w:ilvl="3" w:tplc="EE3C3B9A">
       <w:numFmt w:val="decimal"/>
       <w:lvlText w:val=""/>
       <w:lvlJc w:val="left"/>
     </w:lvl>
-    <w:lvl w:ilvl="4" w:tplc="64B4A774">
+    <w:lvl w:ilvl="4" w:tplc="F1F85830">
       <w:numFmt w:val="decimal"/>
       <w:lvlText w:val=""/>
       <w:lvlJc w:val="left"/>
     </w:lvl>
-    <w:lvl w:ilvl="5" w:tplc="A84CEB34">
+    <w:lvl w:ilvl="5" w:tplc="8DE28222">
       <w:numFmt w:val="decimal"/>
       <w:lvlText w:val=""/>
       <w:lvlJc w:val="left"/>
     </w:lvl>
-    <w:lvl w:ilvl="6" w:tplc="E32EF946">
+    <w:lvl w:ilvl="6" w:tplc="ED8CD786">
       <w:numFmt w:val="decimal"/>
       <w:lvlText w:val=""/>
       <w:lvlJc w:val="left"/>
     </w:lvl>
-    <w:lvl w:ilvl="7" w:tplc="A4FCEA46">
+    <w:lvl w:ilvl="7" w:tplc="C96CC740">
       <w:numFmt w:val="decimal"/>
       <w:lvlText w:val=""/>
       <w:lvlJc w:val="left"/>
     </w:lvl>
-    <w:lvl w:ilvl="8" w:tplc="35F45A16">
+    <w:lvl w:ilvl="8" w:tplc="72C68AAA">
       <w:numFmt w:val="decimal"/>
       <w:lvlText w:val=""/>
       <w:lvlJc w:val="left"/>
     </w:lvl>
   </w:abstractNum>
-  <w:num w:numId="1" w16cid:durableId="148404728">
-    <w:abstractNumId w:val="0"/>
+  <w:num w:numId="1" w16cid:durableId="2106606633">
+    <w:abstractNumId w:val="1"/>
     <w:lvlOverride w:ilvl="0">
       <w:startOverride w:val="1"/>
     </w:lvlOverride>
   </w:num>
-  <w:num w:numId="2" w16cid:durableId="979111099">
-    <w:abstractNumId w:val="1"/>
+  <w:num w:numId="2" w16cid:durableId="1682853231">
+    <w:abstractNumId w:val="0"/>
     <w:lvlOverride w:ilvl="0">
       <w:startOverride w:val="1"/>
     </w:lvlOverride>
@@ -14313,7 +14324,7 @@
     <w:autoRedefine/>
     <w:uiPriority w:val="39"/>
     <w:unhideWhenUsed/>
-    <w:rsid w:val="004B0DA8"/>
+    <w:rsid w:val="005E462F"/>
     <w:pPr>
       <w:spacing w:after="100"/>
     </w:pPr>
@@ -14325,7 +14336,7 @@
     <w:autoRedefine/>
     <w:uiPriority w:val="39"/>
     <w:unhideWhenUsed/>
-    <w:rsid w:val="004B0DA8"/>
+    <w:rsid w:val="005E462F"/>
     <w:pPr>
       <w:spacing w:after="100"/>
       <w:ind w:left="220"/>

</xml_diff>

<commit_message>
Мониторинг на Victoria: VictoriaMetrics, VictoriaLogs, VictoriaTraces; логи — stdout + Vector через Docker socket
- Сервисы в хранилища сами не пишут: логи только в stdout (JSON по умолчанию), Vector читает их через
  /var/run/docker.sock и отправляет в VictoriaLogs; VictoriaMetrics забирает /metrics (pull);
  трассировки — OTLP в коллектор → VictoriaTraces. OTLP-метрики и логи сервиса по умолчанию выключены.
- Из сервиса удалена прямая отправка в Loki (Observability:Loki, OBS_LOKI_*, Serilog.Sinks.Grafana.Loki).
- Стенд: vmscrape.yml / vmscrape-ha.yml, vector.yaml, коллектор на Victoria, Grafana с плагином VictoriaLogs
  (образ собирается локально — закрытый контур), дашборд на VictoriaMetrics и LogsQL; export-images собирает Grafana.
- E2E run-observability.ps1 (метрики, логи через Vector, трассировки, источники Grafana) — в e2e.yml.
- Документация, ЧТЗ, ArchiMate-модель и схемы обновлены.

Co-Authored-By: Claude Opus 5.5 <noreply@anthropic.com>
</commit_message>
<xml_diff>
--- a/docs/TZ-tsl-auth.docx
+++ b/docs/TZ-tsl-auth.docx
@@ -12897,7 +12897,23 @@
           <w:sz w:val="22"/>
           <w:szCs w:val="22"/>
         </w:rPr>
-        <w:t xml:space="preserve">, метрики Prometheus, трассировки и журналы по OTLP, журналы в Loki. Метрики: число входов и отказов, выдача токенов по grant type, блокировки, очередь вебхуков, время ответа. Идентификатор трассировки связывает запрос и журнал приложения; с событием журнала безопасности — после А-2а. Пороги уведомлений и ответственные — по решению A17 архитектурного ЧТЗ.</w:t>
+        <w:t xml:space="preserve">, метрики в формате Prometheus (</w:t>
+      </w:r>
+      <w:r>
+        <w:rPr>
+          <w:rFonts w:ascii="Consolas" w:cs="Consolas" w:eastAsia="Consolas" w:hAnsi="Consolas"/>
+          <w:sz w:val="20"/>
+          <w:szCs w:val="20"/>
+        </w:rPr>
+        <w:t xml:space="preserve">/metrics</w:t>
+      </w:r>
+      <w:r>
+        <w:rPr>
+          <w:rFonts w:ascii="Arial" w:cs="Arial" w:eastAsia="Arial" w:hAnsi="Arial"/>
+          <w:sz w:val="22"/>
+          <w:szCs w:val="22"/>
+        </w:rPr>
+        <w:t xml:space="preserve">, их опрашивает VictoriaMetrics), трассировки по OTLP (через коллектор в VictoriaTraces), журналы в stdout (их собирает Vector в VictoriaLogs). Метрики: число входов и отказов, выдача токенов по grant type, блокировки, очередь вебхуков, время ответа. Идентификатор трассировки связывает запрос и журнал приложения; с событием журнала безопасности — после А-2а. Пороги уведомлений и ответственные — по решению A17 архитектурного ЧТЗ.</w:t>
       </w:r>
     </w:p>
     <w:p>
@@ -15571,11 +15587,19 @@
             </w:pPr>
             <w:r>
               <w:rPr>
-                <w:rFonts w:ascii="Arial" w:cs="Arial" w:eastAsia="Arial" w:hAnsi="Arial"/>
-                <w:sz w:val="19"/>
-                <w:szCs w:val="19"/>
-              </w:rPr>
-              <w:t xml:space="preserve">Prometheus, OpenTelemetry, Loki</w:t>
+                <w:rFonts w:ascii="Consolas" w:cs="Consolas" w:eastAsia="Consolas" w:hAnsi="Consolas"/>
+                <w:sz w:val="17"/>
+                <w:szCs w:val="17"/>
+              </w:rPr>
+              <w:t xml:space="preserve">/metrics</w:t>
+            </w:r>
+            <w:r>
+              <w:rPr>
+                <w:rFonts w:ascii="Arial" w:cs="Arial" w:eastAsia="Arial" w:hAnsi="Arial"/>
+                <w:sz w:val="19"/>
+                <w:szCs w:val="19"/>
+              </w:rPr>
+              <w:t xml:space="preserve">, OpenTelemetry; VictoriaMetrics, VictoriaLogs, VictoriaTraces</w:t>
             </w:r>
           </w:p>
         </w:tc>

</xml_diff>